<commit_message>
Refactor methodology section and update figures in research documentation; enhance clarity and detail in algorithmic framework description.
</commit_message>
<xml_diff>
--- a/research/research_document.docx
+++ b/research/research_document.docx
@@ -203,7 +203,7 @@
           <w:color w:val="0E7490"/>
           <w:sz w:val="28"/>
         </w:rPr>
-        <w:t>2. Modular Methodology &amp; Lab Syllabus Integration</w:t>
+        <w:t>2. Proposed Methodology &amp; Algorithmic Framework</w:t>
       </w:r>
     </w:p>
     <w:p>
@@ -216,7 +216,7 @@
           <w:color w:val="334155"/>
           <w:sz w:val="21"/>
         </w:rPr>
-        <w:t>Our framework synthesizes the individual theoretical pillars taught across the academic curriculum into an integrated, modular diagnostic pipeline:</w:t>
+        <w:t>Our framework synthesizes deep representation learning with foundational probabilistic graphical modeling into an integrated, modular diagnostic pipeline:</w:t>
       </w:r>
     </w:p>
     <w:p>
@@ -230,7 +230,7 @@
           <w:color w:val="0F172A"/>
           <w:sz w:val="21"/>
         </w:rPr>
-        <w:t xml:space="preserve">• Practical 6 (Deep Generative Autoencoders): </w:t>
+        <w:t xml:space="preserve">• Deep Generative Vision (Convolutional Autoencoder): </w:t>
       </w:r>
       <w:r>
         <w:rPr>
@@ -238,7 +238,7 @@
           <w:color w:val="334155"/>
           <w:sz w:val="21"/>
         </w:rPr>
-        <w:t>A Convolutional Autoencoder (ConvAE) with four convolutional layers, batch normalization, and LeakyReLU activations compresses healthy baseline scans into a 32-dimensional bottleneck latent representation z. Trained strictly on normal controls, foreign structural pathologies generate high reconstruction residuals.</w:t>
+        <w:t>A Convolutional Autoencoder (ConvAE) with four convolutional layers, batch normalization, and LeakyReLU activations compresses healthy baseline scans into a 128-dimensional bottleneck latent representation z. Trained strictly on normal controls, foreign structural pathologies generate prominent reconstruction residuals.</w:t>
       </w:r>
     </w:p>
     <w:p>
@@ -252,7 +252,7 @@
           <w:color w:val="0F172A"/>
           <w:sz w:val="21"/>
         </w:rPr>
-        <w:t xml:space="preserve">• Practical 3 (Markov Random Fields): </w:t>
+        <w:t xml:space="preserve">• Spatial Regularization (2D Lattice Markov Random Field): </w:t>
       </w:r>
       <w:r>
         <w:rPr>
@@ -260,7 +260,7 @@
           <w:color w:val="334155"/>
           <w:sz w:val="21"/>
         </w:rPr>
-        <w:t>A 2D lattice MRF models spatial dependencies across pixel labels y ∈ {0, 1}. Using an Ising-style clique potential penalty β = 1.0, the MRF penalizes isolated noisy pixels and clusters contiguous anatomical lesion regions via Iterated Conditional Modes (ICM).</w:t>
+        <w:t>A 2D lattice MRF models spatial dependencies across pixel labels y ∈ {0, 1}. Using an Potts-style clique potential penalty β = 1.0, the MRF penalizes isolated noisy pixels and clusters contiguous anatomical lesion regions via Iterated Conditional Modes (ICM).</w:t>
       </w:r>
     </w:p>
     <w:p>
@@ -274,7 +274,7 @@
           <w:color w:val="0F172A"/>
           <w:sz w:val="21"/>
         </w:rPr>
-        <w:t xml:space="preserve">• Practical 4 (Restricted Boltzmann Machines): </w:t>
+        <w:t xml:space="preserve">• Energy-Based Latent Prior (Restricted Boltzmann Machine): </w:t>
       </w:r>
       <w:r>
         <w:rPr>
@@ -282,7 +282,7 @@
           <w:color w:val="334155"/>
           <w:sz w:val="21"/>
         </w:rPr>
-        <w:t>A Restricted Boltzmann Machine (32 visible, 64 hidden units) trained via Contrastive Divergence (CD-1) monitors the latent bottleneck z. It computes thermodynamic Free Energy F(z) to catch out-of-distribution representations.</w:t>
+        <w:t>A Restricted Boltzmann Machine (RBM) trained via Contrastive Divergence (CD-1) monitors the latent bottleneck z. It computes thermodynamic Free Energy F(z) to detect semantic out-of-distribution shifts.</w:t>
       </w:r>
     </w:p>
     <w:p>
@@ -296,7 +296,7 @@
           <w:color w:val="0F172A"/>
           <w:sz w:val="21"/>
         </w:rPr>
-        <w:t xml:space="preserve">• Practical 1 (Joint &amp; Conditional Distributions): </w:t>
+        <w:t xml:space="preserve">• Empirical Joint Probability &amp; Risk Analysis: </w:t>
       </w:r>
       <w:r>
         <w:rPr>
@@ -304,7 +304,7 @@
           <w:color w:val="334155"/>
           <w:sz w:val="21"/>
         </w:rPr>
-        <w:t>Constructs the empirical joint probability matrix P(Disease, AnomalyScore), verifies ∑ Joint = 1.0, and computes marginal disease prevalence and conditional risks.</w:t>
+        <w:t>Constructs empirical joint probability matrices P(Disease, AnomalyScore), verifies ∑ Joint = 1.0, and computes marginal disease prevalence and conditional risks.</w:t>
       </w:r>
     </w:p>
     <w:p>
@@ -318,7 +318,7 @@
           <w:color w:val="0F172A"/>
           <w:sz w:val="21"/>
         </w:rPr>
-        <w:t xml:space="preserve">• Practical 2 (Bayesian Networks &amp; Inference): </w:t>
+        <w:t xml:space="preserve">• Causal Graphical Modeling (Directed Bayesian Network): </w:t>
       </w:r>
       <w:r>
         <w:rPr>
@@ -340,7 +340,7 @@
           <w:color w:val="0F172A"/>
           <w:sz w:val="21"/>
         </w:rPr>
-        <w:t xml:space="preserve">• Practical 5 (Markov Chains &amp; Stationary Distributions): </w:t>
+        <w:t xml:space="preserve">• Longitudinal Patient Trajectory (Discrete-Time Markov Chain): </w:t>
       </w:r>
       <w:r>
         <w:rPr>
@@ -376,7 +376,7 @@
           <w:color w:val="334155"/>
           <w:sz w:val="21"/>
         </w:rPr>
-        <w:t>The framework was implemented in PyTorch and evaluated on an Nvidia T4 GPU on Google Colab across 6,000 normal baseline training scans and 2,000 test scans (1,000 normal controls and 1,000 pathological anomalies).</w:t>
+        <w:t>The framework was implemented in PyTorch and evaluated on an Nvidia T4 GPU on Google Colab across 6,000 normal baseline training scans and 2,000 test scans (1,000 normal controls and 1,000 pathological anomalies) at 128×128 resolution.</w:t>
       </w:r>
     </w:p>
     <w:tbl>

</xml_diff>